<commit_message>
Generador de la bitácora en Word: sin páginas casi vacías en las entradas largas
</commit_message>
<xml_diff>
--- a/3.1_filtro_dimensionalidad/bitacora.docx
+++ b/3.1_filtro_dimensionalidad/bitacora.docx
@@ -1320,7 +1320,7 @@
           </w:tcPr>
           <w:p>
             <w:pPr>
-              <w:keepNext/>
+              <w:keepNext w:val="false"/>
               <w:spacing w:after="0"/>
             </w:pPr>
             <w:r>
@@ -1347,7 +1347,7 @@
           </w:tcPr>
           <w:p>
             <w:pPr>
-              <w:keepNext/>
+              <w:keepNext w:val="false"/>
               <w:spacing w:after="0" w:before="0"/>
             </w:pPr>
             <w:r>
@@ -1377,7 +1377,7 @@
           </w:tcPr>
           <w:p>
             <w:pPr>
-              <w:keepNext/>
+              <w:keepNext w:val="false"/>
               <w:spacing w:after="0"/>
             </w:pPr>
             <w:r>
@@ -1404,7 +1404,7 @@
           </w:tcPr>
           <w:p>
             <w:pPr>
-              <w:keepNext/>
+              <w:keepNext w:val="false"/>
               <w:spacing w:after="0" w:before="0"/>
             </w:pPr>
             <w:r>
@@ -1434,7 +1434,7 @@
           </w:tcPr>
           <w:p>
             <w:pPr>
-              <w:keepNext/>
+              <w:keepNext w:val="false"/>
               <w:spacing w:after="0"/>
             </w:pPr>
             <w:r>
@@ -1461,7 +1461,7 @@
           </w:tcPr>
           <w:p>
             <w:pPr>
-              <w:keepNext/>
+              <w:keepNext w:val="false"/>
               <w:spacing w:after="0" w:before="0"/>
             </w:pPr>
             <w:r>
@@ -1476,7 +1476,7 @@
       </w:tr>
       <w:tr>
         <w:trPr>
-          <w:cantSplit/>
+          <w:cantSplit w:val="off"/>
         </w:trPr>
         <w:tc>
           <w:tcPr>
@@ -1491,7 +1491,7 @@
           </w:tcPr>
           <w:p>
             <w:pPr>
-              <w:keepNext/>
+              <w:keepNext w:val="false"/>
               <w:spacing w:after="0"/>
             </w:pPr>
             <w:r>
@@ -1518,7 +1518,7 @@
           </w:tcPr>
           <w:p>
             <w:pPr>
-              <w:keepNext/>
+              <w:keepNext w:val="false"/>
               <w:spacing w:after="80" w:before="0"/>
             </w:pPr>
             <w:r>
@@ -2329,7 +2329,7 @@
           </w:tbl>
           <w:p>
             <w:pPr>
-              <w:keepNext/>
+              <w:keepNext w:val="false"/>
               <w:spacing w:after="0" w:before="100"/>
             </w:pPr>
             <w:r>
@@ -2344,7 +2344,7 @@
       </w:tr>
       <w:tr>
         <w:trPr>
-          <w:cantSplit/>
+          <w:cantSplit w:val="off"/>
         </w:trPr>
         <w:tc>
           <w:tcPr>
@@ -2359,7 +2359,7 @@
           </w:tcPr>
           <w:p>
             <w:pPr>
-              <w:keepNext/>
+              <w:keepNext w:val="false"/>
               <w:spacing w:after="0"/>
             </w:pPr>
             <w:r>
@@ -2386,7 +2386,7 @@
           </w:tcPr>
           <w:p>
             <w:pPr>
-              <w:keepNext/>
+              <w:keepNext w:val="false"/>
               <w:spacing w:after="80" w:before="0"/>
             </w:pPr>
             <w:r>
@@ -3356,7 +3356,7 @@
           </w:tcPr>
           <w:p>
             <w:pPr>
-              <w:keepNext/>
+              <w:keepNext w:val="false"/>
               <w:spacing w:after="0"/>
             </w:pPr>
             <w:r>
@@ -3383,7 +3383,7 @@
           </w:tcPr>
           <w:p>
             <w:pPr>
-              <w:keepNext/>
+              <w:keepNext w:val="false"/>
               <w:spacing w:after="0" w:before="0"/>
             </w:pPr>
             <w:r>
@@ -3398,7 +3398,7 @@
       </w:tr>
       <w:tr>
         <w:trPr>
-          <w:cantSplit/>
+          <w:cantSplit w:val="off"/>
         </w:trPr>
         <w:tc>
           <w:tcPr>
@@ -3413,7 +3413,7 @@
           </w:tcPr>
           <w:p>
             <w:pPr>
-              <w:keepNext/>
+              <w:keepNext w:val="false"/>
               <w:spacing w:after="0"/>
             </w:pPr>
             <w:r>
@@ -3440,7 +3440,7 @@
           </w:tcPr>
           <w:p>
             <w:pPr>
-              <w:keepNext/>
+              <w:keepNext w:val="false"/>
               <w:spacing w:after="80" w:before="0"/>
             </w:pPr>
             <w:r>
@@ -3471,7 +3471,7 @@
           </w:p>
           <w:p>
             <w:pPr>
-              <w:keepNext/>
+              <w:keepNext w:val="false"/>
               <w:spacing w:after="0" w:before="0"/>
             </w:pPr>
             <w:r>
@@ -3486,7 +3486,7 @@
       </w:tr>
       <w:tr>
         <w:trPr>
-          <w:cantSplit/>
+          <w:cantSplit w:val="off"/>
         </w:trPr>
         <w:tc>
           <w:tcPr>
@@ -3501,7 +3501,7 @@
           </w:tcPr>
           <w:p>
             <w:pPr>
-              <w:keepNext/>
+              <w:keepNext w:val="false"/>
               <w:spacing w:after="0"/>
             </w:pPr>
             <w:r>
@@ -3528,7 +3528,7 @@
           </w:tcPr>
           <w:p>
             <w:pPr>
-              <w:keepNext/>
+              <w:keepNext w:val="false"/>
               <w:spacing w:after="80" w:before="0"/>
             </w:pPr>
             <w:r>
@@ -4215,7 +4215,7 @@
           </w:tbl>
           <w:p>
             <w:pPr>
-              <w:keepNext/>
+              <w:keepNext w:val="false"/>
               <w:spacing w:after="0" w:before="100"/>
             </w:pPr>
             <w:r>
@@ -4295,7 +4295,7 @@
           </w:tcPr>
           <w:p>
             <w:pPr>
-              <w:keepNext/>
+              <w:keepNext w:val="false"/>
               <w:spacing w:after="0"/>
             </w:pPr>
             <w:r>
@@ -4322,7 +4322,7 @@
           </w:tcPr>
           <w:p>
             <w:pPr>
-              <w:keepNext/>
+              <w:keepNext w:val="false"/>
               <w:spacing w:after="0" w:before="0"/>
             </w:pPr>
             <w:r>
@@ -4384,7 +4384,7 @@
           </w:tcPr>
           <w:p>
             <w:pPr>
-              <w:keepNext/>
+              <w:keepNext w:val="false"/>
               <w:spacing w:after="0"/>
             </w:pPr>
             <w:r>
@@ -4411,7 +4411,7 @@
           </w:tcPr>
           <w:p>
             <w:pPr>
-              <w:keepNext/>
+              <w:keepNext w:val="false"/>
               <w:spacing w:after="0" w:before="0"/>
             </w:pPr>
             <w:r>
@@ -4457,7 +4457,7 @@
           </w:tcPr>
           <w:p>
             <w:pPr>
-              <w:keepNext/>
+              <w:keepNext w:val="false"/>
               <w:spacing w:after="0"/>
             </w:pPr>
             <w:r>
@@ -4484,7 +4484,7 @@
           </w:tcPr>
           <w:p>
             <w:pPr>
-              <w:keepNext/>
+              <w:keepNext w:val="false"/>
               <w:spacing w:after="0" w:before="0"/>
             </w:pPr>
             <w:r>
@@ -4635,7 +4635,7 @@
           </w:tcPr>
           <w:p>
             <w:pPr>
-              <w:keepNext/>
+              <w:keepNext w:val="false"/>
               <w:spacing w:after="0"/>
             </w:pPr>
             <w:r>
@@ -4662,7 +4662,7 @@
           </w:tcPr>
           <w:p>
             <w:pPr>
-              <w:keepNext/>
+              <w:keepNext w:val="false"/>
               <w:spacing w:after="0" w:before="0"/>
             </w:pPr>
             <w:r>
@@ -4797,7 +4797,7 @@
           </w:tcPr>
           <w:p>
             <w:pPr>
-              <w:keepNext/>
+              <w:keepNext w:val="false"/>
               <w:spacing w:after="0"/>
             </w:pPr>
             <w:r>
@@ -4824,7 +4824,7 @@
           </w:tcPr>
           <w:p>
             <w:pPr>
-              <w:keepNext/>
+              <w:keepNext w:val="false"/>
               <w:spacing w:after="0" w:before="0"/>
             </w:pPr>
             <w:r>
@@ -5077,7 +5077,7 @@
       </w:tr>
       <w:tr>
         <w:trPr>
-          <w:cantSplit/>
+          <w:cantSplit w:val="off"/>
         </w:trPr>
         <w:tc>
           <w:tcPr>
@@ -5092,7 +5092,7 @@
           </w:tcPr>
           <w:p>
             <w:pPr>
-              <w:keepNext/>
+              <w:keepNext w:val="false"/>
               <w:spacing w:after="0"/>
             </w:pPr>
             <w:r>
@@ -5119,7 +5119,7 @@
           </w:tcPr>
           <w:p>
             <w:pPr>
-              <w:keepNext/>
+              <w:keepNext w:val="false"/>
               <w:spacing w:after="80" w:before="0"/>
             </w:pPr>
             <w:r>
@@ -5588,7 +5588,7 @@
           </w:tcPr>
           <w:p>
             <w:pPr>
-              <w:keepNext/>
+              <w:keepNext w:val="false"/>
               <w:spacing w:after="0"/>
             </w:pPr>
             <w:r>
@@ -5615,7 +5615,7 @@
           </w:tcPr>
           <w:p>
             <w:pPr>
-              <w:keepNext/>
+              <w:keepNext w:val="false"/>
               <w:spacing w:after="0" w:before="0"/>
             </w:pPr>
             <w:r>
@@ -5645,7 +5645,7 @@
           </w:tcPr>
           <w:p>
             <w:pPr>
-              <w:keepNext/>
+              <w:keepNext w:val="false"/>
               <w:spacing w:after="0"/>
             </w:pPr>
             <w:r>
@@ -5672,7 +5672,7 @@
           </w:tcPr>
           <w:p>
             <w:pPr>
-              <w:keepNext/>
+              <w:keepNext w:val="false"/>
               <w:spacing w:after="0" w:before="0"/>
             </w:pPr>
             <w:r>
@@ -5766,7 +5766,7 @@
           </w:tcPr>
           <w:p>
             <w:pPr>
-              <w:keepNext/>
+              <w:keepNext w:val="false"/>
               <w:spacing w:after="0"/>
             </w:pPr>
             <w:r>
@@ -5793,7 +5793,7 @@
           </w:tcPr>
           <w:p>
             <w:pPr>
-              <w:keepNext/>
+              <w:keepNext w:val="false"/>
               <w:spacing w:after="0" w:before="0"/>
             </w:pPr>
             <w:r>
@@ -5855,7 +5855,7 @@
           </w:tcPr>
           <w:p>
             <w:pPr>
-              <w:keepNext/>
+              <w:keepNext w:val="false"/>
               <w:spacing w:after="0"/>
             </w:pPr>
             <w:r>
@@ -5882,7 +5882,7 @@
           </w:tcPr>
           <w:p>
             <w:pPr>
-              <w:keepNext/>
+              <w:keepNext w:val="false"/>
               <w:spacing w:after="0" w:before="0"/>
             </w:pPr>
             <w:r>
@@ -5976,7 +5976,7 @@
           </w:tcPr>
           <w:p>
             <w:pPr>
-              <w:keepNext/>
+              <w:keepNext w:val="false"/>
               <w:spacing w:after="0"/>
             </w:pPr>
             <w:r>
@@ -6003,7 +6003,7 @@
           </w:tcPr>
           <w:p>
             <w:pPr>
-              <w:keepNext/>
+              <w:keepNext w:val="false"/>
               <w:spacing w:after="0" w:before="0"/>
             </w:pPr>
             <w:r>
@@ -6033,7 +6033,7 @@
           </w:tcPr>
           <w:p>
             <w:pPr>
-              <w:keepNext/>
+              <w:keepNext w:val="false"/>
               <w:spacing w:after="0"/>
             </w:pPr>
             <w:r>
@@ -6060,7 +6060,7 @@
           </w:tcPr>
           <w:p>
             <w:pPr>
-              <w:keepNext/>
+              <w:keepNext w:val="false"/>
               <w:spacing w:after="0" w:before="0"/>
             </w:pPr>
             <w:r>
@@ -6106,7 +6106,7 @@
           </w:tcPr>
           <w:p>
             <w:pPr>
-              <w:keepNext/>
+              <w:keepNext w:val="false"/>
               <w:spacing w:after="0"/>
             </w:pPr>
             <w:r>
@@ -6133,7 +6133,7 @@
           </w:tcPr>
           <w:p>
             <w:pPr>
-              <w:keepNext/>
+              <w:keepNext w:val="false"/>
               <w:spacing w:after="0" w:before="0"/>
             </w:pPr>
             <w:r>
@@ -6163,7 +6163,7 @@
           </w:tcPr>
           <w:p>
             <w:pPr>
-              <w:keepNext/>
+              <w:keepNext w:val="false"/>
               <w:spacing w:after="0"/>
             </w:pPr>
             <w:r>
@@ -6190,7 +6190,7 @@
           </w:tcPr>
           <w:p>
             <w:pPr>
-              <w:keepNext/>
+              <w:keepNext w:val="false"/>
               <w:spacing w:after="0" w:before="0"/>
             </w:pPr>
             <w:r>
@@ -6236,7 +6236,7 @@
           </w:tcPr>
           <w:p>
             <w:pPr>
-              <w:keepNext/>
+              <w:keepNext w:val="false"/>
               <w:spacing w:after="0"/>
             </w:pPr>
             <w:r>
@@ -6263,7 +6263,7 @@
           </w:tcPr>
           <w:p>
             <w:pPr>
-              <w:keepNext/>
+              <w:keepNext w:val="false"/>
               <w:spacing w:after="0" w:before="0"/>
             </w:pPr>
             <w:r>
@@ -6293,7 +6293,7 @@
           </w:tcPr>
           <w:p>
             <w:pPr>
-              <w:keepNext/>
+              <w:keepNext w:val="false"/>
               <w:spacing w:after="0"/>
             </w:pPr>
             <w:r>
@@ -6320,7 +6320,7 @@
           </w:tcPr>
           <w:p>
             <w:pPr>
-              <w:keepNext/>
+              <w:keepNext w:val="false"/>
               <w:spacing w:after="0" w:before="0"/>
             </w:pPr>
             <w:r>
@@ -6611,7 +6611,7 @@
           </w:tcPr>
           <w:p>
             <w:pPr>
-              <w:keepNext/>
+              <w:keepNext w:val="false"/>
               <w:spacing w:after="0"/>
             </w:pPr>
             <w:r>
@@ -6638,7 +6638,7 @@
           </w:tcPr>
           <w:p>
             <w:pPr>
-              <w:keepNext/>
+              <w:keepNext w:val="false"/>
               <w:spacing w:after="0" w:before="0"/>
             </w:pPr>
             <w:r>
@@ -6684,7 +6684,7 @@
           </w:tcPr>
           <w:p>
             <w:pPr>
-              <w:keepNext/>
+              <w:keepNext w:val="false"/>
               <w:spacing w:after="0"/>
             </w:pPr>
             <w:r>
@@ -6711,7 +6711,7 @@
           </w:tcPr>
           <w:p>
             <w:pPr>
-              <w:keepNext/>
+              <w:keepNext w:val="false"/>
               <w:spacing w:after="0" w:before="0"/>
             </w:pPr>
             <w:r>
@@ -6741,7 +6741,7 @@
           </w:tcPr>
           <w:p>
             <w:pPr>
-              <w:keepNext/>
+              <w:keepNext w:val="false"/>
               <w:spacing w:after="0"/>
             </w:pPr>
             <w:r>
@@ -6768,7 +6768,7 @@
           </w:tcPr>
           <w:p>
             <w:pPr>
-              <w:keepNext/>
+              <w:keepNext w:val="false"/>
               <w:spacing w:after="0" w:before="0"/>
             </w:pPr>
             <w:r>
@@ -6979,7 +6979,7 @@
           </w:tcPr>
           <w:p>
             <w:pPr>
-              <w:keepNext/>
+              <w:keepNext w:val="false"/>
               <w:spacing w:after="0"/>
             </w:pPr>
             <w:r>
@@ -7006,7 +7006,7 @@
           </w:tcPr>
           <w:p>
             <w:pPr>
-              <w:keepNext/>
+              <w:keepNext w:val="false"/>
               <w:spacing w:after="0" w:before="0"/>
             </w:pPr>
             <w:r>
@@ -7052,7 +7052,7 @@
           </w:tcPr>
           <w:p>
             <w:pPr>
-              <w:keepNext/>
+              <w:keepNext w:val="false"/>
               <w:spacing w:after="0"/>
             </w:pPr>
             <w:r>
@@ -7079,7 +7079,7 @@
           </w:tcPr>
           <w:p>
             <w:pPr>
-              <w:keepNext/>
+              <w:keepNext w:val="false"/>
               <w:spacing w:after="0" w:before="0"/>
             </w:pPr>
             <w:r>
@@ -7125,7 +7125,7 @@
           </w:tcPr>
           <w:p>
             <w:pPr>
-              <w:keepNext/>
+              <w:keepNext w:val="false"/>
               <w:spacing w:after="0"/>
             </w:pPr>
             <w:r>
@@ -7152,7 +7152,7 @@
           </w:tcPr>
           <w:p>
             <w:pPr>
-              <w:keepNext/>
+              <w:keepNext w:val="false"/>
               <w:spacing w:after="0" w:before="0"/>
             </w:pPr>
             <w:r>
@@ -7339,7 +7339,7 @@
       </w:tr>
       <w:tr>
         <w:trPr>
-          <w:cantSplit/>
+          <w:cantSplit w:val="off"/>
         </w:trPr>
         <w:tc>
           <w:tcPr>
@@ -7354,7 +7354,7 @@
           </w:tcPr>
           <w:p>
             <w:pPr>
-              <w:keepNext/>
+              <w:keepNext w:val="false"/>
               <w:spacing w:after="0"/>
             </w:pPr>
             <w:r>
@@ -7381,7 +7381,7 @@
           </w:tcPr>
           <w:p>
             <w:pPr>
-              <w:keepNext/>
+              <w:keepNext w:val="false"/>
               <w:spacing w:after="80" w:before="0"/>
             </w:pPr>
             <w:r>
@@ -8162,7 +8162,7 @@
           </w:tcPr>
           <w:p>
             <w:pPr>
-              <w:keepNext/>
+              <w:keepNext w:val="false"/>
               <w:spacing w:after="0"/>
             </w:pPr>
             <w:r>
@@ -8189,7 +8189,7 @@
           </w:tcPr>
           <w:p>
             <w:pPr>
-              <w:keepNext/>
+              <w:keepNext w:val="false"/>
               <w:spacing w:after="0" w:before="0"/>
             </w:pPr>
             <w:r>
@@ -8219,7 +8219,7 @@
           </w:tcPr>
           <w:p>
             <w:pPr>
-              <w:keepNext/>
+              <w:keepNext w:val="false"/>
               <w:spacing w:after="0"/>
             </w:pPr>
             <w:r>
@@ -8246,7 +8246,7 @@
           </w:tcPr>
           <w:p>
             <w:pPr>
-              <w:keepNext/>
+              <w:keepNext w:val="false"/>
               <w:spacing w:after="0" w:before="0"/>
             </w:pPr>
             <w:r>
@@ -8276,7 +8276,7 @@
           </w:tcPr>
           <w:p>
             <w:pPr>
-              <w:keepNext/>
+              <w:keepNext w:val="false"/>
               <w:spacing w:after="0"/>
             </w:pPr>
             <w:r>
@@ -8303,7 +8303,7 @@
           </w:tcPr>
           <w:p>
             <w:pPr>
-              <w:keepNext/>
+              <w:keepNext w:val="false"/>
               <w:spacing w:after="0" w:before="0"/>
             </w:pPr>
             <w:r>
@@ -8381,7 +8381,7 @@
           </w:tcPr>
           <w:p>
             <w:pPr>
-              <w:keepNext/>
+              <w:keepNext w:val="false"/>
               <w:spacing w:after="0"/>
             </w:pPr>
             <w:r>
@@ -8408,7 +8408,7 @@
           </w:tcPr>
           <w:p>
             <w:pPr>
-              <w:keepNext/>
+              <w:keepNext w:val="false"/>
               <w:spacing w:after="0" w:before="0"/>
             </w:pPr>
             <w:r>
@@ -8463,7 +8463,7 @@
           </w:tcPr>
           <w:p>
             <w:pPr>
-              <w:keepNext/>
+              <w:keepNext w:val="false"/>
               <w:spacing w:after="0"/>
             </w:pPr>
             <w:r>
@@ -8490,7 +8490,7 @@
           </w:tcPr>
           <w:p>
             <w:pPr>
-              <w:keepNext/>
+              <w:keepNext w:val="false"/>
               <w:spacing w:after="0" w:before="0"/>
             </w:pPr>
             <w:r>
@@ -8520,7 +8520,7 @@
           </w:tcPr>
           <w:p>
             <w:pPr>
-              <w:keepNext/>
+              <w:keepNext w:val="false"/>
               <w:spacing w:after="0"/>
             </w:pPr>
             <w:r>
@@ -8547,7 +8547,7 @@
           </w:tcPr>
           <w:p>
             <w:pPr>
-              <w:keepNext/>
+              <w:keepNext w:val="false"/>
               <w:spacing w:after="0" w:before="0"/>
             </w:pPr>
             <w:r>
@@ -8791,7 +8791,7 @@
       </w:tr>
       <w:tr>
         <w:trPr>
-          <w:cantSplit/>
+          <w:cantSplit w:val="off"/>
         </w:trPr>
         <w:tc>
           <w:tcPr>
@@ -8806,7 +8806,7 @@
           </w:tcPr>
           <w:p>
             <w:pPr>
-              <w:keepNext/>
+              <w:keepNext w:val="false"/>
               <w:spacing w:after="0"/>
             </w:pPr>
             <w:r>
@@ -8833,7 +8833,7 @@
           </w:tcPr>
           <w:p>
             <w:pPr>
-              <w:keepNext/>
+              <w:keepNext w:val="false"/>
               <w:spacing w:after="80" w:before="0"/>
             </w:pPr>
             <w:r>
@@ -9298,7 +9298,7 @@
           </w:tcPr>
           <w:p>
             <w:pPr>
-              <w:keepNext/>
+              <w:keepNext w:val="false"/>
               <w:spacing w:after="0"/>
             </w:pPr>
             <w:r>
@@ -9325,7 +9325,7 @@
           </w:tcPr>
           <w:p>
             <w:pPr>
-              <w:keepNext/>
+              <w:keepNext w:val="false"/>
               <w:spacing w:after="0" w:before="0"/>
             </w:pPr>
             <w:r>
@@ -9355,7 +9355,7 @@
           </w:tcPr>
           <w:p>
             <w:pPr>
-              <w:keepNext/>
+              <w:keepNext w:val="false"/>
               <w:spacing w:after="0"/>
             </w:pPr>
             <w:r>
@@ -9382,7 +9382,7 @@
           </w:tcPr>
           <w:p>
             <w:pPr>
-              <w:keepNext/>
+              <w:keepNext w:val="false"/>
               <w:spacing w:after="0" w:before="0"/>
             </w:pPr>
             <w:r>
@@ -9412,7 +9412,7 @@
           </w:tcPr>
           <w:p>
             <w:pPr>
-              <w:keepNext/>
+              <w:keepNext w:val="false"/>
               <w:spacing w:after="0"/>
             </w:pPr>
             <w:r>
@@ -9439,7 +9439,7 @@
           </w:tcPr>
           <w:p>
             <w:pPr>
-              <w:keepNext/>
+              <w:keepNext w:val="false"/>
               <w:spacing w:after="0" w:before="0"/>
             </w:pPr>
             <w:r>
@@ -9582,7 +9582,7 @@
       </w:tr>
       <w:tr>
         <w:trPr>
-          <w:cantSplit/>
+          <w:cantSplit w:val="off"/>
         </w:trPr>
         <w:tc>
           <w:tcPr>
@@ -9597,7 +9597,7 @@
           </w:tcPr>
           <w:p>
             <w:pPr>
-              <w:keepNext/>
+              <w:keepNext w:val="false"/>
               <w:spacing w:after="0"/>
             </w:pPr>
             <w:r>
@@ -9624,7 +9624,7 @@
           </w:tcPr>
           <w:p>
             <w:pPr>
-              <w:keepNext/>
+              <w:keepNext w:val="false"/>
               <w:spacing w:after="80" w:before="0"/>
             </w:pPr>
             <w:r>
@@ -10577,7 +10577,7 @@
           </w:tcPr>
           <w:p>
             <w:pPr>
-              <w:keepNext/>
+              <w:keepNext w:val="false"/>
               <w:spacing w:after="0"/>
             </w:pPr>
             <w:r>
@@ -10604,7 +10604,7 @@
           </w:tcPr>
           <w:p>
             <w:pPr>
-              <w:keepNext/>
+              <w:keepNext w:val="false"/>
               <w:spacing w:after="0" w:before="0"/>
             </w:pPr>
             <w:r>
@@ -10634,7 +10634,7 @@
           </w:tcPr>
           <w:p>
             <w:pPr>
-              <w:keepNext/>
+              <w:keepNext w:val="false"/>
               <w:spacing w:after="0"/>
             </w:pPr>
             <w:r>
@@ -10661,7 +10661,7 @@
           </w:tcPr>
           <w:p>
             <w:pPr>
-              <w:keepNext/>
+              <w:keepNext w:val="false"/>
               <w:spacing w:after="0" w:before="0"/>
             </w:pPr>
             <w:r>
@@ -10691,7 +10691,7 @@
           </w:tcPr>
           <w:p>
             <w:pPr>
-              <w:keepNext/>
+              <w:keepNext w:val="false"/>
               <w:spacing w:after="0"/>
             </w:pPr>
             <w:r>
@@ -10718,7 +10718,7 @@
           </w:tcPr>
           <w:p>
             <w:pPr>
-              <w:keepNext/>
+              <w:keepNext w:val="false"/>
               <w:spacing w:after="0" w:before="0"/>
             </w:pPr>
             <w:r>
@@ -10853,7 +10853,7 @@
           </w:tcPr>
           <w:p>
             <w:pPr>
-              <w:keepNext/>
+              <w:keepNext w:val="false"/>
               <w:spacing w:after="0"/>
             </w:pPr>
             <w:r>
@@ -10880,7 +10880,7 @@
           </w:tcPr>
           <w:p>
             <w:pPr>
-              <w:keepNext/>
+              <w:keepNext w:val="false"/>
               <w:spacing w:after="0" w:before="0"/>
             </w:pPr>
             <w:r>
@@ -10910,7 +10910,7 @@
           </w:tcPr>
           <w:p>
             <w:pPr>
-              <w:keepNext/>
+              <w:keepNext w:val="false"/>
               <w:spacing w:after="0"/>
             </w:pPr>
             <w:r>
@@ -10937,7 +10937,7 @@
           </w:tcPr>
           <w:p>
             <w:pPr>
-              <w:keepNext/>
+              <w:keepNext w:val="false"/>
               <w:spacing w:after="0" w:before="0"/>
             </w:pPr>
             <w:r>
@@ -10985,7 +10985,7 @@
           </w:tcPr>
           <w:p>
             <w:pPr>
-              <w:keepNext/>
+              <w:keepNext w:val="false"/>
               <w:spacing w:after="0"/>
             </w:pPr>
             <w:r>
@@ -11012,7 +11012,7 @@
           </w:tcPr>
           <w:p>
             <w:pPr>
-              <w:keepNext/>
+              <w:keepNext w:val="false"/>
               <w:spacing w:after="0" w:before="0"/>
             </w:pPr>
             <w:r>
@@ -11223,7 +11223,7 @@
           </w:tcPr>
           <w:p>
             <w:pPr>
-              <w:keepNext/>
+              <w:keepNext w:val="false"/>
               <w:spacing w:after="0"/>
             </w:pPr>
             <w:r>
@@ -11250,7 +11250,7 @@
           </w:tcPr>
           <w:p>
             <w:pPr>
-              <w:keepNext/>
+              <w:keepNext w:val="false"/>
               <w:spacing w:after="0" w:before="0"/>
             </w:pPr>
             <w:r>
@@ -11305,7 +11305,7 @@
           </w:tcPr>
           <w:p>
             <w:pPr>
-              <w:keepNext/>
+              <w:keepNext w:val="false"/>
               <w:spacing w:after="0"/>
             </w:pPr>
             <w:r>
@@ -11332,7 +11332,7 @@
           </w:tcPr>
           <w:p>
             <w:pPr>
-              <w:keepNext/>
+              <w:keepNext w:val="false"/>
               <w:spacing w:after="0" w:before="0"/>
             </w:pPr>
             <w:r>
@@ -11362,7 +11362,7 @@
           </w:tcPr>
           <w:p>
             <w:pPr>
-              <w:keepNext/>
+              <w:keepNext w:val="false"/>
               <w:spacing w:after="0"/>
             </w:pPr>
             <w:r>
@@ -11389,7 +11389,7 @@
           </w:tcPr>
           <w:p>
             <w:pPr>
-              <w:keepNext/>
+              <w:keepNext w:val="false"/>
               <w:spacing w:after="0" w:before="0"/>
             </w:pPr>
             <w:r>
@@ -11419,7 +11419,7 @@
           </w:tcPr>
           <w:p>
             <w:pPr>
-              <w:keepNext/>
+              <w:keepNext w:val="false"/>
               <w:spacing w:after="0"/>
             </w:pPr>
             <w:r>
@@ -11446,7 +11446,7 @@
           </w:tcPr>
           <w:p>
             <w:pPr>
-              <w:keepNext/>
+              <w:keepNext w:val="false"/>
               <w:spacing w:after="0" w:before="0"/>
             </w:pPr>
             <w:r>
@@ -11492,7 +11492,7 @@
           </w:tcPr>
           <w:p>
             <w:pPr>
-              <w:keepNext/>
+              <w:keepNext w:val="false"/>
               <w:spacing w:after="0"/>
             </w:pPr>
             <w:r>
@@ -11519,7 +11519,7 @@
           </w:tcPr>
           <w:p>
             <w:pPr>
-              <w:keepNext/>
+              <w:keepNext w:val="false"/>
               <w:spacing w:after="0" w:before="0"/>
             </w:pPr>
             <w:r>
@@ -11549,7 +11549,7 @@
           </w:tcPr>
           <w:p>
             <w:pPr>
-              <w:keepNext/>
+              <w:keepNext w:val="false"/>
               <w:spacing w:after="0"/>
             </w:pPr>
             <w:r>
@@ -11576,7 +11576,7 @@
           </w:tcPr>
           <w:p>
             <w:pPr>
-              <w:keepNext/>
+              <w:keepNext w:val="false"/>
               <w:spacing w:after="0" w:before="0"/>
             </w:pPr>
             <w:r>
@@ -11624,7 +11624,7 @@
           </w:tcPr>
           <w:p>
             <w:pPr>
-              <w:keepNext/>
+              <w:keepNext w:val="false"/>
               <w:spacing w:after="0"/>
             </w:pPr>
             <w:r>
@@ -11651,7 +11651,7 @@
           </w:tcPr>
           <w:p>
             <w:pPr>
-              <w:keepNext/>
+              <w:keepNext w:val="false"/>
               <w:spacing w:after="0" w:before="0"/>
             </w:pPr>
             <w:r>
@@ -11722,7 +11722,7 @@
           </w:tcPr>
           <w:p>
             <w:pPr>
-              <w:keepNext/>
+              <w:keepNext w:val="false"/>
               <w:spacing w:after="0"/>
             </w:pPr>
             <w:r>
@@ -11749,7 +11749,7 @@
           </w:tcPr>
           <w:p>
             <w:pPr>
-              <w:keepNext/>
+              <w:keepNext w:val="false"/>
               <w:spacing w:after="0" w:before="0"/>
             </w:pPr>
             <w:r>
@@ -11779,7 +11779,7 @@
           </w:tcPr>
           <w:p>
             <w:pPr>
-              <w:keepNext/>
+              <w:keepNext w:val="false"/>
               <w:spacing w:after="0"/>
             </w:pPr>
             <w:r>
@@ -11806,7 +11806,7 @@
           </w:tcPr>
           <w:p>
             <w:pPr>
-              <w:keepNext/>
+              <w:keepNext w:val="false"/>
               <w:spacing w:after="0" w:before="0"/>
             </w:pPr>
             <w:r>
@@ -11845,7 +11845,7 @@
           </w:tcPr>
           <w:p>
             <w:pPr>
-              <w:keepNext/>
+              <w:keepNext w:val="false"/>
               <w:spacing w:after="0"/>
             </w:pPr>
             <w:r>
@@ -11872,7 +11872,7 @@
           </w:tcPr>
           <w:p>
             <w:pPr>
-              <w:keepNext/>
+              <w:keepNext w:val="false"/>
               <w:spacing w:after="0" w:before="0"/>
             </w:pPr>
             <w:r>
@@ -12139,7 +12139,7 @@
       </w:tr>
       <w:tr>
         <w:trPr>
-          <w:cantSplit/>
+          <w:cantSplit w:val="off"/>
         </w:trPr>
         <w:tc>
           <w:tcPr>
@@ -12154,7 +12154,7 @@
           </w:tcPr>
           <w:p>
             <w:pPr>
-              <w:keepNext/>
+              <w:keepNext w:val="false"/>
               <w:spacing w:after="0"/>
             </w:pPr>
             <w:r>
@@ -12181,7 +12181,7 @@
           </w:tcPr>
           <w:p>
             <w:pPr>
-              <w:keepNext/>
+              <w:keepNext w:val="false"/>
               <w:spacing w:after="80" w:before="0"/>
             </w:pPr>
             <w:r>
@@ -13964,7 +13964,7 @@
           </w:tcPr>
           <w:p>
             <w:pPr>
-              <w:keepNext/>
+              <w:keepNext w:val="false"/>
               <w:spacing w:after="0"/>
             </w:pPr>
             <w:r>
@@ -13991,7 +13991,7 @@
           </w:tcPr>
           <w:p>
             <w:pPr>
-              <w:keepNext/>
+              <w:keepNext w:val="false"/>
               <w:spacing w:after="0" w:before="0"/>
             </w:pPr>
             <w:r>
@@ -14075,7 +14075,7 @@
           </w:tcPr>
           <w:p>
             <w:pPr>
-              <w:keepNext/>
+              <w:keepNext w:val="false"/>
               <w:spacing w:after="0"/>
             </w:pPr>
             <w:r>
@@ -14102,7 +14102,7 @@
           </w:tcPr>
           <w:p>
             <w:pPr>
-              <w:keepNext/>
+              <w:keepNext w:val="false"/>
               <w:spacing w:after="0" w:before="0"/>
             </w:pPr>
             <w:r>
@@ -14117,7 +14117,7 @@
       </w:tr>
       <w:tr>
         <w:trPr>
-          <w:cantSplit/>
+          <w:cantSplit w:val="off"/>
         </w:trPr>
         <w:tc>
           <w:tcPr>
@@ -14132,7 +14132,7 @@
           </w:tcPr>
           <w:p>
             <w:pPr>
-              <w:keepNext/>
+              <w:keepNext w:val="false"/>
               <w:spacing w:after="0"/>
             </w:pPr>
             <w:r>
@@ -14159,7 +14159,7 @@
           </w:tcPr>
           <w:p>
             <w:pPr>
-              <w:keepNext/>
+              <w:keepNext w:val="false"/>
               <w:spacing w:after="80" w:before="0"/>
             </w:pPr>
             <w:r>
@@ -14881,7 +14881,7 @@
           </w:tcPr>
           <w:p>
             <w:pPr>
-              <w:keepNext/>
+              <w:keepNext w:val="false"/>
               <w:spacing w:after="0"/>
             </w:pPr>
             <w:r>
@@ -14908,7 +14908,7 @@
           </w:tcPr>
           <w:p>
             <w:pPr>
-              <w:keepNext/>
+              <w:keepNext w:val="false"/>
               <w:spacing w:after="0" w:before="0"/>
             </w:pPr>
             <w:r>
@@ -14923,7 +14923,7 @@
       </w:tr>
       <w:tr>
         <w:trPr>
-          <w:cantSplit/>
+          <w:cantSplit w:val="off"/>
         </w:trPr>
         <w:tc>
           <w:tcPr>
@@ -14938,7 +14938,7 @@
           </w:tcPr>
           <w:p>
             <w:pPr>
-              <w:keepNext/>
+              <w:keepNext w:val="false"/>
               <w:spacing w:after="0"/>
             </w:pPr>
             <w:r>
@@ -15353,7 +15353,7 @@
           </w:tcPr>
           <w:p>
             <w:pPr>
-              <w:keepNext/>
+              <w:keepNext w:val="false"/>
               <w:spacing w:after="0"/>
             </w:pPr>
             <w:r>
@@ -15380,7 +15380,7 @@
           </w:tcPr>
           <w:p>
             <w:pPr>
-              <w:keepNext/>
+              <w:keepNext w:val="false"/>
               <w:spacing w:after="0" w:before="0"/>
             </w:pPr>
             <w:r>
@@ -15419,7 +15419,7 @@
           </w:tcPr>
           <w:p>
             <w:pPr>
-              <w:keepNext/>
+              <w:keepNext w:val="false"/>
               <w:spacing w:after="0"/>
             </w:pPr>
             <w:r>
@@ -15446,7 +15446,7 @@
           </w:tcPr>
           <w:p>
             <w:pPr>
-              <w:keepNext/>
+              <w:keepNext w:val="false"/>
               <w:spacing w:after="0" w:before="0"/>
             </w:pPr>
             <w:r>
@@ -15565,7 +15565,7 @@
           </w:tcPr>
           <w:p>
             <w:pPr>
-              <w:keepNext/>
+              <w:keepNext w:val="false"/>
               <w:spacing w:after="0"/>
             </w:pPr>
             <w:r>
@@ -15592,7 +15592,7 @@
           </w:tcPr>
           <w:p>
             <w:pPr>
-              <w:keepNext/>
+              <w:keepNext w:val="false"/>
               <w:spacing w:after="0" w:before="0"/>
             </w:pPr>
             <w:r>
@@ -15622,7 +15622,7 @@
           </w:tcPr>
           <w:p>
             <w:pPr>
-              <w:keepNext/>
+              <w:keepNext w:val="false"/>
               <w:spacing w:after="0"/>
             </w:pPr>
             <w:r>
@@ -15649,7 +15649,7 @@
           </w:tcPr>
           <w:p>
             <w:pPr>
-              <w:keepNext/>
+              <w:keepNext w:val="false"/>
               <w:spacing w:after="0" w:before="0"/>
             </w:pPr>
             <w:r>
@@ -15688,7 +15688,7 @@
           </w:tcPr>
           <w:p>
             <w:pPr>
-              <w:keepNext/>
+              <w:keepNext w:val="false"/>
               <w:spacing w:after="0"/>
             </w:pPr>
             <w:r>
@@ -15715,7 +15715,7 @@
           </w:tcPr>
           <w:p>
             <w:pPr>
-              <w:keepNext/>
+              <w:keepNext w:val="false"/>
               <w:spacing w:after="0" w:before="0"/>
             </w:pPr>
             <w:r>
@@ -15933,7 +15933,7 @@
           </w:tcPr>
           <w:p>
             <w:pPr>
-              <w:keepNext/>
+              <w:keepNext w:val="false"/>
               <w:spacing w:after="0"/>
             </w:pPr>
             <w:r>
@@ -15960,7 +15960,7 @@
           </w:tcPr>
           <w:p>
             <w:pPr>
-              <w:keepNext/>
+              <w:keepNext w:val="false"/>
               <w:spacing w:after="0" w:before="0"/>
             </w:pPr>
             <w:r>
@@ -16008,7 +16008,7 @@
           </w:tcPr>
           <w:p>
             <w:pPr>
-              <w:keepNext/>
+              <w:keepNext w:val="false"/>
               <w:spacing w:after="0"/>
             </w:pPr>
             <w:r>
@@ -16035,7 +16035,7 @@
           </w:tcPr>
           <w:p>
             <w:pPr>
-              <w:keepNext/>
+              <w:keepNext w:val="false"/>
               <w:spacing w:after="0" w:before="0"/>
             </w:pPr>
             <w:r>

</xml_diff>